<commit_message>
Registra a ressalva do pct_desmatado de Nova Ubirata e corrige o coeficiente da multa
- 2.3 do relatorio estendido: a incompatibilidade de vintage entre numerador
  (PRODES, malha pre-desmembramento) e denominador (IBGE 2025) estava so no
  comentario do check e no CHANGELOG. 8,93% publicado, 5,80% sobre a area
  pre-desmembramento, unico municipio, sem efeito em ordenacao ou quantis.
- 5.5: o coeficiente da multa era -0,401. O modelo m2f, agora no repositorio,
  da -0,3992 no fixest e -0,3992 no pyfixest -- dois motores, mesma quarta casa.
  O -0,401 nao sai deste modelo; corrigido para -0,399.
</commit_message>
<xml_diff>
--- a/deliverables/EGMS_03_relatorio_estendido.docx
+++ b/deliverables/EGMS_03_relatorio_estendido.docx
@@ -821,7 +821,7 @@
     </w:p>
     <w:p>
       <w:r>
-        <w:t xml:space="preserve">A coluna pct_desmatado (total desmatado no painel ÷ área territorial do município, IBGE 2025) responde à crítica clássica de unidade de área (MAUP): municípios amazônicos variam de centenas a &gt;150.000 km². É coluna de contexto, não critério de ordenação, e o teste mostrou que captura eixo distinto: o máximo do painel é Cujubim (RO), com 29,79% do território desmatado em 18 anos e EGS médio de apenas 0,578 (bem abaixo do top 15). Distribuição: mediana 1,10%, p75 3,38%.</w:t>
+        <w:t xml:space="preserve">A coluna pct_desmatado (total desmatado no painel ÷ área territorial do município, IBGE 2025) responde à crítica clássica de unidade de área (MAUP): municípios amazônicos variam de centenas a &gt;150.000 km². É coluna de contexto, não critério de ordenação, e o teste mostrou que captura eixo distinto: o máximo do painel é Cujubim (RO), com 29,79% do território desmatado em 18 anos e EGS médio de apenas 0,578 (bem abaixo do top 15). Distribuição: mediana 1,10%, p75 3,38%. Uma exceção conhecida: Nova Ubiratã (MT) teve Boa Esperança do Norte desmembrada de seu território em 2025, e as duas fontes registram o desmembramento em tempos diferentes — o PRODES ainda agrega a área pré-desmembramento, o arquivo de áreas do IBGE 2025 já a separa. Seu pct_desmatado divide, portanto, um numerador antigo por um denominador novo (8,93%; sobre os 13.425 km² pré-desmembramento seriam 5,80%). É o único município do painel nessa situação, não afeta a ordenação nem os quantis acima, e está registrado no check missing_legal_amazon_munis.</w:t>
       </w:r>
     </w:p>
     <w:p>
@@ -3626,7 +3626,7 @@
     </w:p>
     <w:p>
       <w:r>
-        <w:t xml:space="preserve">Corte estreito (um lag): isolando a variação abrupta (Δlog-área de t−1 para t) como preditor da resposta em t+1, controlando o nível contemporâneo, o sinal é o oposto do esperado: um salto abrupto está associado a MENOS autos e MENOS multa no ano seguinte (autos: −0,057, p &lt; 0,01, modelo m2; multa: −0,401, p &lt; 0,001, modelo m2f), efeito que sobrevive ao controle por área em t+1 e persiste em t+2. “Associado”, e não “prevê”: o desenho é observacional, e o regressor de interesse é por construção função do nível de desmatamento que entra como controle. Separado em alta (d_pos) e queda (d_neg) abruptas, o efeito é específico da alta (autos: −0,114, EP 0,032, p &lt; 0,001; queda: −0,005, n.s.): descartando reversão à média genérica como explicação mecânica.</w:t>
+        <w:t xml:space="preserve">Corte estreito (um lag): isolando a variação abrupta (Δlog-área de t−1 para t) como preditor da resposta em t+1, controlando o nível contemporâneo, o sinal é o oposto do esperado: um salto abrupto está associado a MENOS autos e MENOS multa no ano seguinte (autos: −0,057, p &lt; 0,01, modelo m2; multa: −0,399, p &lt; 0,001, modelo m2f), efeito que sobrevive ao controle por área em t+1 e persiste em t+2. “Associado”, e não “prevê”: o desenho é observacional, e o regressor de interesse é por construção função do nível de desmatamento que entra como controle. Separado em alta (d_pos) e queda (d_neg) abruptas, o efeito é específico da alta (autos: −0,114, EP 0,032, p &lt; 0,001; queda: −0,005, n.s.): descartando reversão à média genérica como explicação mecânica.</w:t>
       </w:r>
     </w:p>
     <w:p>

</xml_diff>

<commit_message>
Declara a base das figuras de cancelamento e relativiza a igualdade 805-33=772
- Legendas das figuras de cancelamento (Fig. 6 do writing sample; 8 e 9 do
  estendido) passam a declarar a base: 48.063 autos de tipo desmatamento nos 772
  municipios, em qualquer situacao -- a taxa exige incluir os cancelados --, e
  nao comparavel aos 60.707 do pipeline, nacionais e sem cancelados. O escopo
  sempre esteve certo no codigo; faltava o leitor saber.
- Comentarios de 01_staging.sql e 02_marts.sql deixam de apresentar
  "805 - 33 = 772, exatamente a contagem oficial" como confirmacao: os dois
  numeros coincidem porque ambos antecedem Boa Esperanca do Norte/MT, e a
  contagem oficial deve passar a 773. Coincidencia a vigiar, nao validacao.
</commit_message>
<xml_diff>
--- a/deliverables/EGMS_03_relatorio_estendido.docx
+++ b/deliverables/EGMS_03_relatorio_estendido.docx
@@ -5272,7 +5272,7 @@
           <w:color w:val="5A655C"/>
           <w:sz w:val="18"/>
         </w:rPr>
-        <w:t>Figura 8. Taxa de cancelamento por ano (pico 2017–2019).</w:t>
+        <w:t>Figura 8. Taxa de cancelamento por ano (pico 2017–2019). Base: 48.063 autos de tipo desmatamento nos 772 municípios do painel, em qualquer situação — a taxa exige incluir os cancelados; não confundir com os 60.707 do pipeline, que são nacionais e já excluem cancelados.</w:t>
       </w:r>
     </w:p>
     <w:p>
@@ -5337,7 +5337,7 @@
           <w:color w:val="5A655C"/>
           <w:sz w:val="18"/>
         </w:rPr>
-        <w:t>Figura 9. Taxa de cancelamento por UF (≥100 autos).</w:t>
+        <w:t>Figura 9. Taxa de cancelamento por UF (≥100 autos). Mesma base da Figura 8.</w:t>
       </w:r>
     </w:p>
     <w:p>

</xml_diff>

<commit_message>
Enxuga cabecalho e check de 04_export.sql
</commit_message>
<xml_diff>
--- a/deliverables/EGMS_03_relatorio_estendido.docx
+++ b/deliverables/EGMS_03_relatorio_estendido.docx
@@ -788,10 +788,7 @@
         <w:t xml:space="preserve">export_ranking_stale = 0</w:t>
       </w:r>
       <w:r>
-        <w:t xml:space="preserve"> (relê o parquet recém-escrito e compara a ordem física das 772 linhas com o ranking recomputado: o modo de falha “parquet gerado antes de uma correção de ordenação” aconteceu de verdade e nenhum check de contagem o pegaria).</w:t>
-      </w:r>
-      <w:r>
-        <w:t xml:space="preserve"> Uma quarta nasceu na sexta auditoria: missing_legal_amazon_munis = 1 compara o conjunto de geocodes contra a referência do IBGE nos oito estados integralmente contidos na Amazônia Legal, e registra que falta Boa Esperança do Norte/MT (5101837), desmembrado de Nova Ubiratã em 2025 e novo demais para a malha do PRODES. O painel são os 772 municípios que o PRODES mapeia; a contagem oficial da Amazônia Legal segue 772 e deve passar a 773 numa atualização futura. n_geocodes_prodes_clean fixa uma contagem, não um conjunto, e por isso não via a ausência.</w:t>
+        <w:t xml:space="preserve"> (relê o parquet recém-escrito e compara a ordem física das 772 linhas com o ranking recomputado: o modo de falha “parquet gerado antes de uma correção de ordenação” aconteceu de verdade e nenhum check de contagem o pegaria). Uma quarta nasceu na sexta auditoria: missing_legal_amazon_munis = 1 compara o conjunto de geocodes contra a referência do IBGE nos oito estados integralmente contidos na Amazônia Legal, e registra que falta Boa Esperança do Norte/MT (5101837), desmembrado de Nova Ubiratã em 2025 e novo demais para a malha do PRODES. O painel são os 772 municípios que o PRODES mapeia; a contagem oficial da Amazônia Legal segue 772 e deve passar a 773 numa atualização futura. n_geocodes_prodes_clean fixa uma contagem, não um conjunto, e por isso não via a ausência.</w:t>
       </w:r>
     </w:p>
     <w:p>
@@ -1527,7 +1524,7 @@
         <w:ind w:firstLine="709"/>
       </w:pPr>
       <w:r>
-        <w:t xml:space="preserve">552 dos 772 municípios têm ao menos um ano de pressão. Assimetria documentada: anos absolute_gap pontuam mais alto em média que measured_gap (0,723 vs. 0,582): o piso nunca os desconta, coerente com a leitura declarada de que resposta zero é lacuna mais grave que resposta desproporcional.</w:t>
+        <w:t xml:space="preserve">552 dos 772 municípios têm ao menos um ano de pressão. Assimetria documentada: anos absolute_gap pontuam mais alto em média que measured_gap (0,723 vs. 0,582): o piso nunca os desconta, coerente com a leitura declarada de que resposta zero é lacuna mais grave que resposta desproporcional. A categoria absolute_gap agrega dois casos tratados de forma idêntica pela fórmula: ausência total de autuação e autuação lavrada com multa nula ou próxima de zero.</w:t>
       </w:r>
     </w:p>
     <w:p>

</xml_diff>

<commit_message>
Congela exploration: reorganiza em tres partes, aponta para a base publica do IBAMA, remove Power BI dos deliverables
</commit_message>
<xml_diff>
--- a/deliverables/EGMS_03_relatorio_estendido.docx
+++ b/deliverables/EGMS_03_relatorio_estendido.docx
@@ -308,7 +308,7 @@
                 <w:sz w:val="17"/>
                 <w:szCs w:val="17"/>
               </w:rPr>
-              <w:t xml:space="preserve">13.896 linhas; 772 geocodes × 18 anos; 2025 possivelmente não consolidado</w:t>
+              <w:t xml:space="preserve">13.896 linhas; 772 geocodes × 18 anos; 2025 diverge -8,3% da taxa nacional consolidada</w:t>
             </w:r>
           </w:p>
         </w:tc>
@@ -697,6 +697,14 @@
       </w:pPr>
       <w:r>
         <w:t xml:space="preserve">Os valores esperados das verificações são fotografias desses snapshots: o IBAMA pode revisar retroativamente seus CSVs e o PRODES consolida o último ano meses depois da estimativa preliminar. Quem baixar os dados no futuro pode ver checks falhando sem que exista bug; o README documenta as datas exatamente por isso.</w:t>
+      </w:r>
+    </w:p>
+    <w:p>
+      <w:pPr>
+        <w:ind w:firstLine="709"/>
+      </w:pPr>
+      <w:r>
+        <w:t xml:space="preserve">O painel usa 772 municípios, não os 805 do arquivo do TerraBrasilis: 33 geocodes do export rotulado "legal_amazon" estão em estados fora da Amazônia Legal, todos com desmatamento zero em todos os 18 anos. O recorte é feito por prefixo de UF, o que herda do TerraBrasilis a definição de quais municípios do Maranhão pertencem à Amazônia Legal, já que o estado entra parcialmente.</w:t>
       </w:r>
     </w:p>
     <w:p>
@@ -812,7 +820,7 @@
         <w:ind w:firstLine="709"/>
       </w:pPr>
       <w:r>
-        <w:t xml:space="preserve">Dos 309.116 autos brutos, o recorte de desmatamento retém 60.707 (soma nominal de controle: R$ 26.814.492.927), pela união de três casos, com SIT_CANCELADO = 'N' e DES_STATUS_FORMULARIO = 'Lavrado': (1) TIPO_INFRACAO = 'Flora' com INFRACAO_AREA = 'Desmatamento': 58.051 autos; (2) 'Flora' com área nula e código de infração específico de desmatamento (seis códigos, ex.: destruir/danificar florestas nativas; concentrados em 2008–2012, quando o campo de área não era obrigatório): 2.129; (3) tipo nulo com área 'Desmatamento': 527. A data usada é DAT_HORA_AUTO_INFRACAO (0% de NA), não DT_FATO_INFRACIONAL (71% de NA na base filtrada): decisão documentada com sua validação de lag (§4.2). Categorias excluídas: o IBAMA também classifica autos como INFRACAO_AREA = “Desmatamento e Queimada”, 2.051 lavrados e R$ 1,88 bilhão, deixados de fora porque o registro não separa a supressão da queima. A exclusão subestima a resposta federal, nunca o contrário. O custo foi medido: incluindo essa categoria e o código 409906 no caso (2), a base vai de 60.707 para 63.213 autos e o ranking praticamente não se move, com Spearman 0,9999 entre os rankings completos dos 772 municípios, os mesmos 20 no topo e 49 dos 50 primeiros. A maior troca de posição é Maués, de 9º para 16º. A decisão de recorte não sustenta o resultado.</w:t>
+        <w:t xml:space="preserve">Dos 309.116 autos brutos, o recorte de desmatamento retém 60.707 (soma nominal de controle: R$ 26.814.492.927), pela união de três casos, com SIT_CANCELADO = 'N' e DES_STATUS_FORMULARIO = 'Lavrado': (1) TIPO_INFRACAO = 'Flora' com INFRACAO_AREA = 'Desmatamento': 58.051 autos; (2) 'Flora' com área nula e código de infração específico de desmatamento (seis códigos, ex.: destruir/danificar florestas nativas; concentrados em 2008–2012, quando o campo de área não era obrigatório): 2.129; (3) tipo nulo com área 'Desmatamento': 527. A data usada é DAT_HORA_AUTO_INFRACAO (0% de NA), não DT_FATO_INFRACIONAL (71% de NA na base filtrada): decisão documentada com sua validação de lag (§4.2). Categorias excluídas: o IBAMA também classifica autos como INFRACAO_AREA = “Desmatamento e Queimada”, 2.051 lavrados e R$ 1,88 bilhão, deixados de fora porque o registro não separa a supressão da queima. A exclusão subestima a resposta federal, nunca o contrário. O custo foi medido: incluindo essa categoria e o código 409906 no caso (2), a base vai de 60.707 para 63.213 autos e o ranking praticamente não se move, com Spearman 0,9999 entre os rankings completos dos 772 municípios, os mesmos 20 no topo e 49 dos 50 primeiros. A maior troca de posição é Maués, de 9º para 16º. A decisão de recorte não sustenta o resultado. Também fica de fora o código 409999, o mais frequente da base (77.872 autos): é rótulo genérico, e os autos de desmatamento que o carregam já entram pelos casos 1 e 3, via INFRACAO_AREA. Os 14.710 restantes têm tipo e área nulos, sem sinal que permita classificá-los.</w:t>
       </w:r>
     </w:p>
     <w:p>
@@ -887,6 +895,22 @@
     </w:p>
     <w:p>
       <w:pPr>
+        <w:ind w:firstLine="709"/>
+      </w:pPr>
+      <w:r>
+        <w:t xml:space="preserve">O denominador combina as duas dimensões da resposta federal por média geométrica, não por soma nem por média aritmética. A escolha decorre de uma propriedade: a média geométrica se anula quando qualquer um dos fatores é zero, enquanto a soma permite que um fator alto compense a ausência do outro. Autuação sem valor e valor sem autuação são tratados como resposta ausente, não como resposta parcial. A média geométrica também penaliza o desequilíbrio: para uma mesma soma dos fatores, ela é máxima quando os dois se igualam, de modo que muitos autos de valor irrisório, ou um auto isolado de valor alto, produzem denominador menor que uma combinação equilibrada, e portanto EGS maior.</w:t>
+      </w:r>
+    </w:p>
+    <w:p>
+      <w:pPr>
+        <w:ind w:firstLine="709"/>
+      </w:pPr>
+      <w:r>
+        <w:t xml:space="preserve">Os pesos são iguais, o que corresponde à raiz quadrada do produto. Uma generalização ponderada é possível, na forma autos^w × multas^(1-w), e a literatura de dissuasão oferece argumento para w &gt; 0,5: a revisão de Nagin (2013) conclui que a certeza da punição tem efeito dissuasório mais consistente que sua severidade. A adaptação não foi adotada por duas razões. O número de autos registra resposta institucional, não probabilidade de apreensão, de modo que a correspondência com a certeza da literatura é analógica. E qualquer valor específico de w exigiria calibração que este trabalho não realiza. Fica registrada como extensão possível, sem teste de sensibilidade nesta versão.</w:t>
+      </w:r>
+    </w:p>
+    <w:p>
+      <w:pPr>
         <w:pStyle w:val="Heading2"/>
       </w:pPr>
       <w:r>
@@ -908,7 +932,7 @@
         <w:t xml:space="preserve">Teste: </w:t>
       </w:r>
       <w:r>
-        <w:t xml:space="preserve">com multas deflacionadas, o piso reproduz a fórmula antiga em 100% dos ex-absolute_gap e em 3.257/3.285 (99,1%) dos ex-measured_gap; os 28 divergentes (0,9%; 61 com valores nominais: ambos fixados por checks) são precisamente os casos de fronteira, tornados mais conservadores. Distribuição do denominador bruto no measured_gap: mediana 2,07, p25 1,56, máximo 4,56, mínimo 0,796. O piso é inerte para a massa dos dados.</w:t>
+        <w:t xml:space="preserve">com multas deflacionadas, o piso reproduz a fórmula antiga em 100% dos ex-absolute_gap e em 3.257/3.285 (99,1%) dos ex-measured_gap; os 28 divergentes (0,9%; 61 com valores nominais: ambos fixados por checks) são precisamente os casos de fronteira, tornados mais conservadores. Distribuição do denominador bruto no measured_gap: mediana 2,07, p25 1,56, máximo 4,56, mínimo 0,796. O piso é inerte para a massa dos dados. Propriedade que dele decorre: como o denominador nunca é inferior a 1, o EGS de qualquer ano é no máximo log10(1 + área). Esse teto é o valor da lacuna absoluta, de modo que nenhuma resposta ínfima pode pontuar acima de resposta nenhuma.</w:t>
       </w:r>
     </w:p>
     <w:p>
@@ -1006,7 +1030,7 @@
         <w:t xml:space="preserve">Fragilidade validada com casos extremos: </w:t>
       </w:r>
       <w:r>
-        <w:t xml:space="preserve">evento único em 2024 → slope +0,005 (Palmeiras do Tocantins); dois eventos 2008/2017 → −0,017 (Nova Nazaré): a distinção “problema novo vs. antigo” mora na segunda casa decimal quando há poucos pontos. Por isso o slope nunca é lido sozinho: acompanha a média recente e n_years_pressure como indicador de confiabilidade. A janela de 3 anos inclui o PRODES 2025, possivelmente não consolidado: mantida com a nota “último ano sujeito a revisão”, por decisão.</w:t>
+        <w:t xml:space="preserve">evento único em 2024 → slope +0,005 (Palmeiras do Tocantins); dois eventos 2008/2017 → −0,017 (Nova Nazaré): a distinção “problema novo vs. antigo” mora na segunda casa decimal quando há poucos pontos. Por isso o slope nunca é lido sozinho: acompanha a média recente e n_years_pressure como indicador de confiabilidade. A janela de 3 anos inclui 2025, cujo total no painel diverge -8,3% da taxa nacional consolidada, o maior dos quatro desvios de âncora (§4.1), e que segue sujeito a revisão em atualizações posteriores do PRODES.</w:t>
       </w:r>
     </w:p>
     <w:p>
@@ -1073,6 +1097,14 @@
       </w:r>
       <w:r>
         <w:t xml:space="preserve"> no anterior; 4,7% só no mesmo ano; 1,0% só com defasagem de um ano; 35,1% nunca (parcela inflada por geocodes fora da Amazônia Legal). Match same-year total: 63,9%. O rótulo dessas categorias foi corrigido duas vezes em auditoria: a última (quarta auditoria) porque a prosa chamava de “same-year” a categoria both, subestimando a própria validação. Ressalva estrutural documentada: o “ano” PRODES vai de agosto a julho; o ano IBAMA é civil, então as janelas se sobrepõem em ~7 de 12 meses, e a validação de lag foi feita na base de ano civil. Parte do “lag” pode ser esse descompasso de calendário.</w:t>
+      </w:r>
+    </w:p>
+    <w:p>
+      <w:pPr>
+        <w:ind w:firstLine="709"/>
+      </w:pPr>
+      <w:r>
+        <w:t xml:space="preserve">A evidência que de fato discrimina entre as duas janelas é estreita: 59,2% dos autos casam com pressão material nos dois anos e 35,1% em nenhum, de modo que apenas 5,7% (4,7 contra 1,0) separam uma hipótese da outra. A distribuição mensal dos autos, com pico em setembro e outubro, não decide: a estação seca facilita tanto a supressão quanto a operação de campo do IBAMA, e as duas leituras preveem o mesmo padrão. O custo da escolha foi medido: atribuindo o auto do ano seguinte ao desmatamento do ano anterior, 724 dos 3.063 município-anos de lacuna absoluta (23,6%) deixariam essa categoria. O teste documenta a sensibilidade da janela adotada, não a justifica. As quatro proporções são invariantes ao filtro de escopo: os 33 municípios descartados têm área zero em todos os anos e nunca casaram em nenhuma das duas janelas.</w:t>
       </w:r>
     </w:p>
     <w:p>
@@ -1525,6 +1557,14 @@
       </w:pPr>
       <w:r>
         <w:t xml:space="preserve">552 dos 772 municípios têm ao menos um ano de pressão. Assimetria documentada: anos absolute_gap pontuam mais alto em média que measured_gap (0,723 vs. 0,582): o piso nunca os desconta, coerente com a leitura declarada de que resposta zero é lacuna mais grave que resposta desproporcional. A categoria absolute_gap agrega dois casos tratados de forma idêntica pela fórmula: ausência total de autuação e autuação lavrada com multa nula ou próxima de zero.</w:t>
+      </w:r>
+    </w:p>
+    <w:p>
+      <w:pPr>
+        <w:ind w:firstLine="709"/>
+      </w:pPr>
+      <w:r>
+        <w:t xml:space="preserve">O limiar de R$ 0,01 que separa absolute_gap de measured_gap não é um parâmetro calibrado: é o menor valor monetário representável, escolhido para que a categoria signifique ausência de resposta com valor, e não resposta de valor baixo. A fronteira é o zero, e o centavo apenas o operacionaliza em aritmética de ponto flutuante. Isso explica o segundo caso da categoria: autos com valor de multa ausente na fonte (356 dos 60.707, ou 0,6%) contam em n_autos mas somam zero em multas, e o município-ano cai em absolute_gap mesmo tendo autuação registrada. A classificação usa o valor deflacionado, não o nominal, o que afasta do limiar os valores mais antigos.</w:t>
       </w:r>
     </w:p>
     <w:p>
@@ -5730,7 +5770,7 @@
         <w:spacing w:after="0"/>
       </w:pPr>
       <w:r>
-        <w:t xml:space="preserve">Pendências conhecidas, nenhuma bloqueante: dashboard Power BI (parquets prontos); recomputar o overlap do top 20 contra a Portaria 1.717/2026 (lista já pública, 89 municípios); checksums SHA-256 dos brutos e fixture da lista MMA (ambos opcionais); nota de dicionário de dados para n_infractions &gt; 0 em absolute_gap; três guardas sugeridas pela quarta auditoria (NULL em fine_value; chave de prodes_clean; checks de annual_summary).</w:t>
+        <w:t xml:space="preserve">Pendências conhecidas, nenhuma bloqueante: recomputar o overlap do top 20 contra a Portaria 1.717/2026 (lista já pública, 89 municípios); checksums SHA-256 dos brutos e fixture da lista MMA (ambos opcionais); três guardas sugeridas pela quarta auditoria (NULL em fine_value; chave de prodes_clean; checks de annual_summary).</w:t>
       </w:r>
     </w:p>
     <w:p>
@@ -6385,7 +6425,7 @@
         <w:ind w:firstLine="709"/>
       </w:pPr>
       <w:r>
-        <w:t xml:space="preserve">O histograma mostra quantos dias se passam entre o fato gerador da infração e a autuação formal, para o subconjunto de autos que registram as duas datas (cerca de 28% do total, uma amostra parcial); a linha tracejada marca a mediana.</w:t>
+        <w:t xml:space="preserve">O histograma mostra quantos dias se passam entre o fato gerador da infração e a autuação formal, para o subconjunto de autos que registram as duas datas (cerca de 28% do total, uma amostra parcial); a linha tracejada marca a mediana. O preenchimento da data do fato não é aleatório: tende a acompanhar processos mais documentados, de modo que a relação entre valor da multa e defasagem observada nesse subconjunto não se generaliza ao total.</w:t>
       </w:r>
     </w:p>
     <w:p>
@@ -7052,6 +7092,15 @@
       </w:pPr>
       <w:r>
         <w:t xml:space="preserve">MONGABAY. Desmatamento e água contaminada: o lado obscuro do óleo de palma “sustentável” da Amazônia. mar. 2021. Disponível em: https://brasil.mongabay.com/2021/03/desmatamento-e-agua-contaminada-o-lado-obscuro-do-oleo-de-palma-sustentavel-da-amazonia/. Acesso em: 3 ago. 2026.</w:t>
+      </w:r>
+    </w:p>
+    <w:p>
+      <w:pPr>
+        <w:spacing w:after="200" w:line="240" w:lineRule="auto"/>
+        <w:jc w:val="left"/>
+      </w:pPr>
+      <w:r>
+        <w:t xml:space="preserve">NAGIN, Daniel S. Deterrence in the twenty-first century: a review of the evidence. Crime and Justice, Chicago, v. 42, n. 1, p. 199-263, 2013. DOI: 10.1086/670398.</w:t>
       </w:r>
     </w:p>
     <w:p>

</xml_diff>

<commit_message>
viz: corta 4 figuras do MVP 1.0, suite vai de 18 para 14
- saem cancelamento por UF, defasagem fato-autuacao, mix de instrumentos e
  cristas do EGS: nenhuma sustenta a afirmacao central
- renumeracao completa nos scripts, nas PNGs e na secao 8 do relatorio
- 04_raw_ibama.R de 5 para 2 figuras; ggridges sai da dependencia
- viz/README.md e CHANGELOG (secao Removido na 1.1.0)
- references/RETOMADA_2026-08-13.md: estado, decisoes e fila da proxima sessao
</commit_message>
<xml_diff>
--- a/deliverables/EGMS_03_relatorio_estendido.docx
+++ b/deliverables/EGMS_03_relatorio_estendido.docx
@@ -4669,7 +4669,7 @@
         <w:ind w:firstLine="709"/>
       </w:pPr>
       <w:r>
-        <w:t xml:space="preserve">Além da fórmula e do ranking, o painel foi usado para testar diretamente o mecanismo teórico do projeto de doutorado associado (sinal → visibilidade → custo político → resposta): um salto abrupto de desmatamento deveria, por essa lógica, elevar a fiscalização no período seguinte. Testado em painel de efeitos fixos bidimensionais (município e ano, erros-padrão clusterizados por município): o mesmo desenho planejado para a tese, reproduzido em R/fixest (viz/05_panel_effects.R, itens 15 e 16).</w:t>
+        <w:t xml:space="preserve">Além da fórmula e do ranking, o painel foi usado para testar diretamente o mecanismo teórico do projeto de doutorado associado (sinal → visibilidade → custo político → resposta): um salto abrupto de desmatamento deveria, por essa lógica, elevar a fiscalização no período seguinte. Testado em painel de efeitos fixos bidimensionais (município e ano, erros-padrão clusterizados por município): o mesmo desenho planejado para a tese, reproduzido em R/fixest (viz/05_panel_effects.R, itens 11 e 12).</w:t>
       </w:r>
     </w:p>
     <w:p>
@@ -6581,211 +6581,7 @@
         <w:pStyle w:val="Heading2"/>
       </w:pPr>
       <w:r>
-        <w:t xml:space="preserve">8.12 Taxa de cancelamento por estado</w:t>
-      </w:r>
-    </w:p>
-    <w:p>
-      <w:pPr>
-        <w:ind w:firstLine="709"/>
-      </w:pPr>
-      <w:r>
-        <w:t xml:space="preserve">O gráfico de barras compara a taxa de cancelamento de autos entre os estados da Amazônia Legal (apenas os com pelo menos 100 autos), mostrando que o pico de cancelamento não é uniforme geograficamente.</w:t>
-      </w:r>
-    </w:p>
-    <w:p>
-      <w:pPr>
-        <w:jc w:val="center"/>
-      </w:pPr>
-      <w:r>
-        <w:drawing>
-          <wp:inline xmlns:a="http://schemas.openxmlformats.org/drawingml/2006/main" xmlns:pic="http://schemas.openxmlformats.org/drawingml/2006/picture">
-            <wp:extent cx="5486400" cy="4800600"/>
-            <wp:docPr id="1" name="11_cancel_by_state.png"/>
-            <wp:cNvGraphicFramePr>
-              <a:graphicFrameLocks noChangeAspect="1"/>
-            </wp:cNvGraphicFramePr>
-            <a:graphic>
-              <a:graphicData uri="http://schemas.openxmlformats.org/drawingml/2006/picture">
-                <pic:pic>
-                  <pic:nvPicPr>
-                    <pic:cNvPr id="0" name="01_deforestation_abs.png"/>
-                    <pic:cNvPicPr/>
-                  </pic:nvPicPr>
-                  <pic:blipFill>
-                    <a:blip r:embed="rId16"/>
-                    <a:stretch>
-                      <a:fillRect/>
-                    </a:stretch>
-                  </pic:blipFill>
-                  <pic:spPr>
-                    <a:xfrm>
-                      <a:off x="0" y="0"/>
-                      <a:ext cx="5486400" cy="4800600"/>
-                    </a:xfrm>
-                    <a:prstGeom prst="rect"/>
-                  </pic:spPr>
-                </pic:pic>
-              </a:graphicData>
-            </a:graphic>
-          </wp:inline>
-        </w:drawing>
-      </w:r>
-    </w:p>
-    <w:p>
-      <w:pPr>
-        <w:jc w:val="center"/>
-      </w:pPr>
-      <w:r>
-        <w:rPr>
-          <w:i/>
-          <w:color w:val="000000"/>
-          <w:sz w:val="18"/>
-        </w:rPr>
-        <w:t>Figura 11. Taxa de cancelamento por UF (≥100 autos). Mesma base da Figura 10.</w:t>
-      </w:r>
-    </w:p>
-    <w:p>
-      <w:pPr>
-        <w:pStyle w:val="Heading2"/>
-      </w:pPr>
-      <w:r>
-        <w:t xml:space="preserve">8.13 Defasagem entre o fato e a autuação</w:t>
-      </w:r>
-    </w:p>
-    <w:p>
-      <w:pPr>
-        <w:ind w:firstLine="709"/>
-      </w:pPr>
-      <w:r>
-        <w:t xml:space="preserve">O histograma mostra quantos dias se passam entre o fato gerador da infração e a autuação formal, para o subconjunto de autos que registram as duas datas (cerca de 28% do total, uma amostra parcial); a linha tracejada marca a mediana. O preenchimento da data do fato não é aleatório: tende a acompanhar processos mais documentados, de modo que a relação entre valor da multa e defasagem observada nesse subconjunto não se generaliza ao total.</w:t>
-      </w:r>
-    </w:p>
-    <w:p>
-      <w:pPr>
-        <w:jc w:val="center"/>
-      </w:pPr>
-      <w:r>
-        <w:drawing>
-          <wp:inline xmlns:a="http://schemas.openxmlformats.org/drawingml/2006/main" xmlns:pic="http://schemas.openxmlformats.org/drawingml/2006/picture">
-            <wp:extent cx="5486400" cy="4800600"/>
-            <wp:docPr id="1" name="12_fact_notice_lag.png"/>
-            <wp:cNvGraphicFramePr>
-              <a:graphicFrameLocks noChangeAspect="1"/>
-            </wp:cNvGraphicFramePr>
-            <a:graphic>
-              <a:graphicData uri="http://schemas.openxmlformats.org/drawingml/2006/picture">
-                <pic:pic>
-                  <pic:nvPicPr>
-                    <pic:cNvPr id="0" name="01_deforestation_abs.png"/>
-                    <pic:cNvPicPr/>
-                  </pic:nvPicPr>
-                  <pic:blipFill>
-                    <a:blip r:embed="rId17"/>
-                    <a:stretch>
-                      <a:fillRect/>
-                    </a:stretch>
-                  </pic:blipFill>
-                  <pic:spPr>
-                    <a:xfrm>
-                      <a:off x="0" y="0"/>
-                      <a:ext cx="5486400" cy="4800600"/>
-                    </a:xfrm>
-                    <a:prstGeom prst="rect"/>
-                  </pic:spPr>
-                </pic:pic>
-              </a:graphicData>
-            </a:graphic>
-          </wp:inline>
-        </w:drawing>
-      </w:r>
-    </w:p>
-    <w:p>
-      <w:pPr>
-        <w:jc w:val="center"/>
-      </w:pPr>
-      <w:r>
-        <w:rPr>
-          <w:i/>
-          <w:color w:val="000000"/>
-          <w:sz w:val="18"/>
-        </w:rPr>
-        <w:t>Figura 12. Defasagem fato→autuação (mediana 7 dias, cauda longa); amostra parcial (~28%).</w:t>
-      </w:r>
-    </w:p>
-    <w:p>
-      <w:pPr>
-        <w:pStyle w:val="Heading2"/>
-      </w:pPr>
-      <w:r>
-        <w:t xml:space="preserve">8.14 Mix de instrumentos de fiscalização por quintil de EGS</w:t>
-      </w:r>
-    </w:p>
-    <w:p>
-      <w:pPr>
-        <w:ind w:firstLine="709"/>
-      </w:pPr>
-      <w:r>
-        <w:t xml:space="preserve">Os boxplots comparam a proporção de autos com embargo e com apreensão em cada quintil de EGS, indicando se municípios com maior lacuna de fiscalização também usam menos os instrumentos coercitivos disponíveis, além da simples multa.</w:t>
-      </w:r>
-    </w:p>
-    <w:p>
-      <w:pPr>
-        <w:jc w:val="center"/>
-      </w:pPr>
-      <w:r>
-        <w:drawing>
-          <wp:inline xmlns:a="http://schemas.openxmlformats.org/drawingml/2006/main" xmlns:pic="http://schemas.openxmlformats.org/drawingml/2006/picture">
-            <wp:extent cx="5486400" cy="4800600"/>
-            <wp:docPr id="1" name="13_instrument_by_quintile.png"/>
-            <wp:cNvGraphicFramePr>
-              <a:graphicFrameLocks noChangeAspect="1"/>
-            </wp:cNvGraphicFramePr>
-            <a:graphic>
-              <a:graphicData uri="http://schemas.openxmlformats.org/drawingml/2006/picture">
-                <pic:pic>
-                  <pic:nvPicPr>
-                    <pic:cNvPr id="0" name="01_deforestation_abs.png"/>
-                    <pic:cNvPicPr/>
-                  </pic:nvPicPr>
-                  <pic:blipFill>
-                    <a:blip r:embed="rId18"/>
-                    <a:stretch>
-                      <a:fillRect/>
-                    </a:stretch>
-                  </pic:blipFill>
-                  <pic:spPr>
-                    <a:xfrm>
-                      <a:off x="0" y="0"/>
-                      <a:ext cx="5486400" cy="4800600"/>
-                    </a:xfrm>
-                    <a:prstGeom prst="rect"/>
-                  </pic:spPr>
-                </pic:pic>
-              </a:graphicData>
-            </a:graphic>
-          </wp:inline>
-        </w:drawing>
-      </w:r>
-    </w:p>
-    <w:p>
-      <w:pPr>
-        <w:jc w:val="center"/>
-      </w:pPr>
-      <w:r>
-        <w:rPr>
-          <w:i/>
-          <w:color w:val="000000"/>
-          <w:sz w:val="18"/>
-        </w:rPr>
-        <w:t>Figura 13. Composição do instrumento (embargo/apreensão) por quintil de EGS.</w:t>
-      </w:r>
-    </w:p>
-    <w:p>
-      <w:pPr>
-        <w:pStyle w:val="Heading2"/>
-      </w:pPr>
-      <w:r>
-        <w:t xml:space="preserve">8.15 Estimativas do painel com efeitos fixos bidirecionais</w:t>
+        <w:t xml:space="preserve">8.12 Estimativas do painel com efeitos fixos bidirecionais</w:t>
       </w:r>
     </w:p>
     <w:p>
@@ -6845,7 +6641,7 @@
           <w:color w:val="000000"/>
           <w:sz w:val="18"/>
         </w:rPr>
-        <w:t>Figura 14. Estimativas de painel FE bidimensional (município+ano).</w:t>
+        <w:t>Figura 11. Estimativas de painel FE bidimensional (município+ano).</w:t>
       </w:r>
     </w:p>
     <w:p>
@@ -6853,7 +6649,7 @@
         <w:pStyle w:val="Heading2"/>
       </w:pPr>
       <w:r>
-        <w:t xml:space="preserve">8.16 Event study: fiscalização em torno de um surto de desmatamento</w:t>
+        <w:t xml:space="preserve">8.13 Event study: fiscalização em torno de um surto de desmatamento</w:t>
       </w:r>
     </w:p>
     <w:p>
@@ -6913,7 +6709,7 @@
           <w:color w:val="000000"/>
           <w:sz w:val="18"/>
         </w:rPr>
-        <w:t>Figura 15. Event study da ressaca: direcional (autos), frágil (ICs cruzam zero).</w:t>
+        <w:t>Figura 12. Event study da ressaca: direcional (autos), frágil (ICs cruzam zero).</w:t>
       </w:r>
     </w:p>
     <w:p>
@@ -6921,7 +6717,7 @@
         <w:pStyle w:val="Heading2"/>
       </w:pPr>
       <w:r>
-        <w:t xml:space="preserve">8.17 Infratores multados em 3+ municípios</w:t>
+        <w:t xml:space="preserve">8.14 Infratores multados em 3+ municípios</w:t>
       </w:r>
     </w:p>
     <w:p>
@@ -6981,7 +6777,7 @@
           <w:color w:val="000000"/>
           <w:sz w:val="18"/>
         </w:rPr>
-        <w:t>Figura 16. Rede de infratores autuados em 3+ municípios (CPF/CNPJ anonimizado).</w:t>
+        <w:t>Figura 13. Rede de infratores autuados em 3+ municípios (CPF/CNPJ anonimizado).</w:t>
       </w:r>
     </w:p>
     <w:p>
@@ -6989,75 +6785,7 @@
         <w:pStyle w:val="Heading2"/>
       </w:pPr>
       <w:r>
-        <w:t xml:space="preserve">8.18 Distribuição do EGS por ano</w:t>
-      </w:r>
-    </w:p>
-    <w:p>
-      <w:pPr>
-        <w:ind w:firstLine="709"/>
-      </w:pPr>
-      <w:r>
-        <w:t xml:space="preserve">O gráfico de cristas mostra como a distribuição inteira do EGS anual, não apenas a média, se desloca ao longo de 2008 a 2025, revelando mudanças de forma e dispersão que uma série de médias esconderia.</w:t>
-      </w:r>
-    </w:p>
-    <w:p>
-      <w:pPr>
-        <w:jc w:val="center"/>
-      </w:pPr>
-      <w:r>
-        <w:drawing>
-          <wp:inline xmlns:a="http://schemas.openxmlformats.org/drawingml/2006/main" xmlns:pic="http://schemas.openxmlformats.org/drawingml/2006/picture">
-            <wp:extent cx="5486400" cy="4800600"/>
-            <wp:docPr id="1" name="17_egs_ridgeline.png"/>
-            <wp:cNvGraphicFramePr>
-              <a:graphicFrameLocks noChangeAspect="1"/>
-            </wp:cNvGraphicFramePr>
-            <a:graphic>
-              <a:graphicData uri="http://schemas.openxmlformats.org/drawingml/2006/picture">
-                <pic:pic>
-                  <pic:nvPicPr>
-                    <pic:cNvPr id="0" name="01_deforestation_abs.png"/>
-                    <pic:cNvPicPr/>
-                  </pic:nvPicPr>
-                  <pic:blipFill>
-                    <a:blip r:embed="rId22"/>
-                    <a:stretch>
-                      <a:fillRect/>
-                    </a:stretch>
-                  </pic:blipFill>
-                  <pic:spPr>
-                    <a:xfrm>
-                      <a:off x="0" y="0"/>
-                      <a:ext cx="5486400" cy="4800600"/>
-                    </a:xfrm>
-                    <a:prstGeom prst="rect"/>
-                  </pic:spPr>
-                </pic:pic>
-              </a:graphicData>
-            </a:graphic>
-          </wp:inline>
-        </w:drawing>
-      </w:r>
-    </w:p>
-    <w:p>
-      <w:pPr>
-        <w:jc w:val="center"/>
-      </w:pPr>
-      <w:r>
-        <w:rPr>
-          <w:i/>
-          <w:color w:val="000000"/>
-          <w:sz w:val="18"/>
-        </w:rPr>
-        <w:t>Figura 17. Distribuição anual do EGS (anos de pressão): deslocamento no tempo.</w:t>
-      </w:r>
-    </w:p>
-    <w:p>
-      <w:pPr>
-        <w:pStyle w:val="Heading2"/>
-      </w:pPr>
-      <w:r>
-        <w:t xml:space="preserve">8.19 EGS anual dos cinco casos-âncora</w:t>
+        <w:t xml:space="preserve">8.15 EGS anual dos cinco casos-âncora</w:t>
       </w:r>
     </w:p>
     <w:p>
@@ -7117,7 +6845,7 @@
           <w:color w:val="000000"/>
           <w:sz w:val="18"/>
         </w:rPr>
-        <w:t>Figura 18. EGS anual dos cinco casos-âncora (2008–2025). Escalas iguais entre painéis; o eixo y é o EGS anual, não o rank.</w:t>
+        <w:t>Figura 14. EGS anual dos cinco casos-âncora (2008–2025). Escalas iguais entre painéis; o eixo y é o EGS anual, não o rank.</w:t>
       </w:r>
     </w:p>
     <w:p>

</xml_diff>